<commit_message>
Add SEO metadata and admin brand logo upload
</commit_message>
<xml_diff>
--- a/site/Company_Profile_DE.docx
+++ b/site/Company_Profile_DE.docx
@@ -33,6 +33,24 @@
           <w:sz w:val="48"/>
           <w:szCs w:val="48"/>
         </w:rPr>
+        <w:t xml:space="preserve">xcombine</w:t>
+      </w:r>
+    </w:p>
+    <w:p>
+      <w:pPr>
+        <w:spacing w:after="260"/>
+      </w:pPr>
+      <w:r>
+        <w:rPr>
+          <w:rFonts w:ascii="Aptos" w:cs="Aptos" w:eastAsia="Aptos" w:hAnsi="Aptos"/>
+          <w:b/>
+          <w:bCs/>
+          <w:i w:val="false"/>
+          <w:iCs w:val="false"/>
+          <w:color w:val="17324D"/>
+          <w:sz w:val="24"/>
+          <w:szCs w:val="24"/>
+        </w:rPr>
         <w:t xml:space="preserve">Unabhängiges Softwarestudio</w:t>
       </w:r>
     </w:p>
@@ -450,7 +468,7 @@
       <w:pPr>
         <w:spacing w:after="100"/>
       </w:pPr>
-      <w:hyperlink w:history="1" r:id="rIdj36b53i-wt5bi3-61rue6">
+      <w:hyperlink w:history="1" r:id="rIdth2lej37sfy7eb-dtvrsq">
         <w:r>
           <w:rPr>
             <w:rFonts w:ascii="Aptos" w:cs="Aptos" w:eastAsia="Aptos" w:hAnsi="Aptos"/>
@@ -584,7 +602,7 @@
       <w:pPr>
         <w:spacing w:after="100"/>
       </w:pPr>
-      <w:hyperlink w:history="1" r:id="rIdlcdpjfdwvbvvs3xi41tps">
+      <w:hyperlink w:history="1" r:id="rIdnwzmysyld_6il4mnb7nxb">
         <w:r>
           <w:rPr>
             <w:rFonts w:ascii="Aptos" w:cs="Aptos" w:eastAsia="Aptos" w:hAnsi="Aptos"/>
@@ -718,7 +736,7 @@
       <w:pPr>
         <w:spacing w:after="100"/>
       </w:pPr>
-      <w:hyperlink w:history="1" r:id="rIdiwx7srdqazlsifhafmrp1">
+      <w:hyperlink w:history="1" r:id="rIdrk_mvtsw--tp7yvzicz1u">
         <w:r>
           <w:rPr>
             <w:rFonts w:ascii="Aptos" w:cs="Aptos" w:eastAsia="Aptos" w:hAnsi="Aptos"/>
@@ -1947,20 +1965,27 @@
     </w:p>
     <w:p>
       <w:pPr>
-        <w:spacing w:after="120" w:line="290"/>
-      </w:pPr>
-      <w:r>
-        <w:rPr>
-          <w:rFonts w:ascii="Aptos" w:cs="Aptos" w:eastAsia="Aptos" w:hAnsi="Aptos"/>
-          <w:b w:val="false"/>
-          <w:bCs w:val="false"/>
-          <w:i/>
-          <w:iCs/>
-          <w:color w:val="6B7C8F"/>
-          <w:sz w:val="21"/>
-          <w:szCs w:val="21"/>
-        </w:rPr>
-        <w:t xml:space="preserve">Fügen Sie Ihre Kontaktdaten über den Website-Editor hinzu.</w:t>
+        <w:spacing w:after="90" w:line="270"/>
+      </w:pPr>
+      <w:r>
+        <w:rPr>
+          <w:rFonts w:ascii="Aptos" w:cs="Aptos" w:eastAsia="Aptos" w:hAnsi="Aptos"/>
+          <w:b/>
+          <w:bCs/>
+          <w:color w:val="17324D"/>
+          <w:sz w:val="20"/>
+          <w:szCs w:val="20"/>
+        </w:rPr>
+        <w:t xml:space="preserve">Website: </w:t>
+      </w:r>
+      <w:r>
+        <w:rPr>
+          <w:rFonts w:ascii="Aptos" w:cs="Aptos" w:eastAsia="Aptos" w:hAnsi="Aptos"/>
+          <w:color w:val="425466"/>
+          <w:sz w:val="20"/>
+          <w:szCs w:val="20"/>
+        </w:rPr>
+        <w:t xml:space="preserve">https://xcombine.xyz</w:t>
       </w:r>
     </w:p>
     <w:sectPr>

</xml_diff>

<commit_message>
Scale portfolio cover for additional projects
</commit_message>
<xml_diff>
--- a/site/Company_Profile_DE.docx
+++ b/site/Company_Profile_DE.docx
@@ -468,7 +468,7 @@
       <w:pPr>
         <w:spacing w:after="100"/>
       </w:pPr>
-      <w:hyperlink w:history="1" r:id="rIdth2lej37sfy7eb-dtvrsq">
+      <w:hyperlink w:history="1" r:id="rIdaqa4ednr6vmtcs4ywwiit">
         <w:r>
           <w:rPr>
             <w:rFonts w:ascii="Aptos" w:cs="Aptos" w:eastAsia="Aptos" w:hAnsi="Aptos"/>
@@ -602,7 +602,7 @@
       <w:pPr>
         <w:spacing w:after="100"/>
       </w:pPr>
-      <w:hyperlink w:history="1" r:id="rIdnwzmysyld_6il4mnb7nxb">
+      <w:hyperlink w:history="1" r:id="rIds8eewrw4dbj59_nomc-ve">
         <w:r>
           <w:rPr>
             <w:rFonts w:ascii="Aptos" w:cs="Aptos" w:eastAsia="Aptos" w:hAnsi="Aptos"/>
@@ -736,7 +736,7 @@
       <w:pPr>
         <w:spacing w:after="100"/>
       </w:pPr>
-      <w:hyperlink w:history="1" r:id="rIdrk_mvtsw--tp7yvzicz1u">
+      <w:hyperlink w:history="1" r:id="rIdoa_yi9shkhct8scevzcia">
         <w:r>
           <w:rPr>
             <w:rFonts w:ascii="Aptos" w:cs="Aptos" w:eastAsia="Aptos" w:hAnsi="Aptos"/>

</xml_diff>

<commit_message>
Reposition site as a software product studio
</commit_message>
<xml_diff>
--- a/site/Company_Profile_DE.docx
+++ b/site/Company_Profile_DE.docx
@@ -77,7 +77,7 @@
           <w:sz w:val="25"/>
           <w:szCs w:val="25"/>
         </w:rPr>
-        <w:t xml:space="preserve">Unabhängige Entwicklung von CRM-Systemen, Webplattformen, KI-Assistenten und Geschäftsautomatisierung — zugeschnitten auf die tatsächlichen Abläufe Ihres Unternehmens.</w:t>
+        <w:t xml:space="preserve">Nutzen Sie fertige Software, bestellen Sie eine individuelle Lösung oder gestalten Sie ein neues Produkt für die Anforderungen Ihrer Branche.</w:t>
       </w:r>
     </w:p>
     <w:p>
@@ -95,7 +95,7 @@
           <w:sz w:val="18"/>
           <w:szCs w:val="18"/>
         </w:rPr>
-        <w:t xml:space="preserve">Softwareentwicklung • KI-Automatisierung • Geschäftslösungen</w:t>
+        <w:t xml:space="preserve">Produkte / Engineering / Automatisierung</w:t>
       </w:r>
     </w:p>
     <w:p>
@@ -112,7 +112,7 @@
           <w:sz w:val="17"/>
           <w:szCs w:val="17"/>
         </w:rPr>
-        <w:t xml:space="preserve">UNSERE AKTIVEN PRODUKTE</w:t>
+        <w:t xml:space="preserve">SOFORT EINSETZBARE PRODUKTE</w:t>
       </w:r>
     </w:p>
     <w:p>
@@ -246,7 +246,7 @@
           <w:sz w:val="34"/>
           <w:szCs w:val="34"/>
         </w:rPr>
-        <w:t xml:space="preserve">Ihr Unternehmen wächst.</w:t>
+        <w:t xml:space="preserve">Ein Problem. Mehrere Wege zur Lösung.</w:t>
       </w:r>
     </w:p>
     <w:p>
@@ -264,7 +264,7 @@
           <w:sz w:val="22"/>
           <w:szCs w:val="22"/>
         </w:rPr>
-        <w:t xml:space="preserve">Wir sind ein unabhängiges Softwarestudio. Wir entwickeln CRM-Systeme, Webplattformen, KI-Assistenten und Automatisierungen — passend zu Ihrem Unternehmen, nicht umgekehrt.</w:t>
+        <w:t xml:space="preserve">Wir beginnen mit dem Geschäftsbedarf und wählen dann das passende Modell, statt jeden Kunden in die Individualentwicklung zu zwingen.</w:t>
       </w:r>
     </w:p>
     <w:p>
@@ -281,7 +281,7 @@
           <w:sz w:val="17"/>
           <w:szCs w:val="17"/>
         </w:rPr>
-        <w:t xml:space="preserve">WO ZEIT VERLOREN GEHT</w:t>
+        <w:t xml:space="preserve">DREI ARBEITSMODELLE</w:t>
       </w:r>
     </w:p>
     <w:p>
@@ -299,7 +299,7 @@
           <w:sz w:val="26"/>
           <w:szCs w:val="26"/>
         </w:rPr>
-        <w:t xml:space="preserve">Daten sind überall verstreut</w:t>
+        <w:t xml:space="preserve">Individuelle Entwicklung</w:t>
       </w:r>
     </w:p>
     <w:p>
@@ -317,7 +317,7 @@
           <w:sz w:val="20"/>
           <w:szCs w:val="20"/>
         </w:rPr>
-        <w:t xml:space="preserve">Kunden in Excel, Gespräche in WhatsApp, Aufgaben nur im Kopf. Informationen gehen zwischen den Werkzeugen verloren.</w:t>
+        <w:t xml:space="preserve">Ein einzigartiges System für Ihre Prozesse, Integrationen und Betriebsabläufe.</w:t>
       </w:r>
     </w:p>
     <w:p>
@@ -335,7 +335,7 @@
           <w:sz w:val="26"/>
           <w:szCs w:val="26"/>
         </w:rPr>
-        <w:t xml:space="preserve">Jeden Tag dieselbe Arbeit</w:t>
+        <w:t xml:space="preserve">Fertige Produkte</w:t>
       </w:r>
     </w:p>
     <w:p>
@@ -353,7 +353,7 @@
           <w:sz w:val="20"/>
           <w:szCs w:val="20"/>
         </w:rPr>
-        <w:t xml:space="preserve">Gleiche Fragen beantworten, Daten kopieren sowie Dokumente und Berichte manuell erstellen.</w:t>
+        <w:t xml:space="preserve">Ein bestehendes Produkt per Abo oder Lizenz, optional mit Einrichtung und Anpassung.</w:t>
       </w:r>
     </w:p>
     <w:p>
@@ -371,7 +371,7 @@
           <w:sz w:val="26"/>
           <w:szCs w:val="26"/>
         </w:rPr>
-        <w:t xml:space="preserve">Langsame Antworten, verlorene Kunden</w:t>
+        <w:t xml:space="preserve">Produktpartnerschaft</w:t>
       </w:r>
     </w:p>
     <w:p>
@@ -389,7 +389,7 @@
           <w:sz w:val="20"/>
           <w:szCs w:val="20"/>
         </w:rPr>
-        <w:t xml:space="preserve">Wenn eine Anfrage erst Stunden später beantwortet wird, wählt der Interessent möglicherweise die Konkurrenz.</w:t>
+        <w:t xml:space="preserve">Ein wiederkehrendes Problem wird zum gemeinsamen Produkt mit den ersten Kunden.</w:t>
       </w:r>
     </w:p>
     <w:p>
@@ -407,7 +407,7 @@
           <w:sz w:val="34"/>
           <w:szCs w:val="34"/>
         </w:rPr>
-        <w:t xml:space="preserve">Echte Produkte — von uns konzipiert, entwickelt und gestartet.</w:t>
+        <w:t xml:space="preserve">Echte Produkte für den realen Betrieb.</w:t>
       </w:r>
     </w:p>
     <w:p>
@@ -468,7 +468,7 @@
       <w:pPr>
         <w:spacing w:after="100"/>
       </w:pPr>
-      <w:hyperlink w:history="1" r:id="rIdaqa4ednr6vmtcs4ywwiit">
+      <w:hyperlink w:history="1" r:id="rIdfe0jyven0trqvdixti7pb">
         <w:r>
           <w:rPr>
             <w:rFonts w:ascii="Aptos" w:cs="Aptos" w:eastAsia="Aptos" w:hAnsi="Aptos"/>
@@ -550,7 +550,7 @@
           <w:sz w:val="20"/>
           <w:szCs w:val="20"/>
         </w:rPr>
-        <w:t xml:space="preserve">Geschäftlicher Nutzen: </w:t>
+        <w:t xml:space="preserve">Was es leistet: </w:t>
       </w:r>
       <w:r>
         <w:rPr>
@@ -602,7 +602,7 @@
       <w:pPr>
         <w:spacing w:after="100"/>
       </w:pPr>
-      <w:hyperlink w:history="1" r:id="rIds8eewrw4dbj59_nomc-ve">
+      <w:hyperlink w:history="1" r:id="rIdsplmimaunh2gufsmvektc">
         <w:r>
           <w:rPr>
             <w:rFonts w:ascii="Aptos" w:cs="Aptos" w:eastAsia="Aptos" w:hAnsi="Aptos"/>
@@ -684,7 +684,7 @@
           <w:sz w:val="20"/>
           <w:szCs w:val="20"/>
         </w:rPr>
-        <w:t xml:space="preserve">Geschäftlicher Nutzen: </w:t>
+        <w:t xml:space="preserve">Was es leistet: </w:t>
       </w:r>
       <w:r>
         <w:rPr>
@@ -736,7 +736,7 @@
       <w:pPr>
         <w:spacing w:after="100"/>
       </w:pPr>
-      <w:hyperlink w:history="1" r:id="rIdoa_yi9shkhct8scevzcia">
+      <w:hyperlink w:history="1" r:id="rIdmvyohkfn9dbe9cpe4dqxo">
         <w:r>
           <w:rPr>
             <w:rFonts w:ascii="Aptos" w:cs="Aptos" w:eastAsia="Aptos" w:hAnsi="Aptos"/>
@@ -818,7 +818,7 @@
           <w:sz w:val="20"/>
           <w:szCs w:val="20"/>
         </w:rPr>
-        <w:t xml:space="preserve">Geschäftlicher Nutzen: </w:t>
+        <w:t xml:space="preserve">Was es leistet: </w:t>
       </w:r>
       <w:r>
         <w:rPr>
@@ -845,7 +845,7 @@
           <w:sz w:val="34"/>
           <w:szCs w:val="34"/>
         </w:rPr>
-        <w:t xml:space="preserve">Was wir für Ihr Unternehmen entwickeln können</w:t>
+        <w:t xml:space="preserve">Software für Ihren tatsächlichen Betrieb</w:t>
       </w:r>
     </w:p>
     <w:p>
@@ -863,7 +863,7 @@
           <w:sz w:val="21"/>
           <w:szCs w:val="21"/>
         </w:rPr>
-        <w:t xml:space="preserve">Wir beginnen mit dem gewünschten Ergebnis und wählen erst dann die passende Technologie.</w:t>
+        <w:t xml:space="preserve">Wenn Standardwerkzeuge nicht passen, gestalten wir System, Integrationen und Automatisierung entlang Ihres realen Prozesses.</w:t>
       </w:r>
     </w:p>
     <w:p>
@@ -1213,7 +1213,7 @@
           <w:sz w:val="34"/>
           <w:szCs w:val="34"/>
         </w:rPr>
-        <w:t xml:space="preserve">Die richtige Technologie, mit persönlicher Betreuung.</w:t>
+        <w:t xml:space="preserve">Beginnen Sie mit dem Problem eines Kunden. Bauen Sie ein Produkt, das auch andere brauchen.</w:t>
       </w:r>
     </w:p>
     <w:p>
@@ -1231,7 +1231,7 @@
           <w:sz w:val="21"/>
           <w:szCs w:val="21"/>
         </w:rPr>
-        <w:t xml:space="preserve">Sie arbeiten direkt mit dem Entwickler, der Ihr Produkt baut — ohne zusätzliche Managementebenen.</w:t>
+        <w:t xml:space="preserve">Wenn derselbe Bedarf in mehreren Unternehmen auftritt, validieren wir ein gemeinsames Produkt und entwickeln es mit frühen Nutzern weiter.</w:t>
       </w:r>
     </w:p>
     <w:p>
@@ -1248,7 +1248,7 @@
           <w:sz w:val="17"/>
           <w:szCs w:val="17"/>
         </w:rPr>
-        <w:t xml:space="preserve">SCHRITTWEISE EINFÜHRUNG</w:t>
+        <w:t xml:space="preserve">DREI PHASEN</w:t>
       </w:r>
     </w:p>
     <w:p>
@@ -1266,7 +1266,7 @@
           <w:sz w:val="21"/>
           <w:szCs w:val="21"/>
         </w:rPr>
-        <w:t xml:space="preserve">Phase 1 · Kern</w:t>
+        <w:t xml:space="preserve">Phase 1 · Validierung</w:t>
       </w:r>
     </w:p>
     <w:p>
@@ -1284,7 +1284,7 @@
           <w:sz w:val="21"/>
           <w:szCs w:val="21"/>
         </w:rPr>
-        <w:t xml:space="preserve">Ein zentraler Prozess wird automatisiert</w:t>
+        <w:t xml:space="preserve">Wiederkehrenden Bedarf und Wirtschaftlichkeit prüfen</w:t>
       </w:r>
     </w:p>
     <w:p>
@@ -1302,7 +1302,7 @@
           <w:sz w:val="21"/>
           <w:szCs w:val="21"/>
         </w:rPr>
-        <w:t xml:space="preserve">Phase 2 · Integrationen</w:t>
+        <w:t xml:space="preserve">Phase 2 · Start</w:t>
       </w:r>
     </w:p>
     <w:p>
@@ -1320,7 +1320,7 @@
           <w:sz w:val="21"/>
           <w:szCs w:val="21"/>
         </w:rPr>
-        <w:t xml:space="preserve">Anbindung der Werkzeuge, die Sie bereits nutzen</w:t>
+        <w:t xml:space="preserve">Eigentum, Preis und Leistungsumfang festlegen</w:t>
       </w:r>
     </w:p>
     <w:p>
@@ -1338,7 +1338,7 @@
           <w:sz w:val="21"/>
           <w:szCs w:val="21"/>
         </w:rPr>
-        <w:t xml:space="preserve">Phase 3 · KI &amp; Skalierung</w:t>
+        <w:t xml:space="preserve">Phase 3 · Skalierung</w:t>
       </w:r>
     </w:p>
     <w:p>
@@ -1356,7 +1356,7 @@
           <w:sz w:val="21"/>
           <w:szCs w:val="21"/>
         </w:rPr>
-        <w:t xml:space="preserve">Assistenten, Analysen, neue Funktionen</w:t>
+        <w:t xml:space="preserve">Feedback entwickelt das gemeinsame Produkt</w:t>
       </w:r>
     </w:p>
     <w:p>
@@ -1374,7 +1374,7 @@
           <w:sz w:val="26"/>
           <w:szCs w:val="26"/>
         </w:rPr>
-        <w:t xml:space="preserve">Auf Sie zugeschnitten</w:t>
+        <w:t xml:space="preserve">Wiederkehrendes Problem</w:t>
       </w:r>
     </w:p>
     <w:p>
@@ -1392,7 +1392,7 @@
           <w:sz w:val="21"/>
           <w:szCs w:val="21"/>
         </w:rPr>
-        <w:t xml:space="preserve">Keine aufgezwungenen Vorlagen. Wir analysieren Ihre Prozesse und bauen genau das, was gebraucht wird.</w:t>
+        <w:t xml:space="preserve">Wir suchen einen Bedarf mehrerer Unternehmen, nicht nur eine einmalige Anfrage.</w:t>
       </w:r>
     </w:p>
     <w:p>
@@ -1410,7 +1410,7 @@
           <w:sz w:val="26"/>
           <w:szCs w:val="26"/>
         </w:rPr>
-        <w:t xml:space="preserve">Direkt und flexibel</w:t>
+        <w:t xml:space="preserve">Kommerzielle Validation</w:t>
       </w:r>
     </w:p>
     <w:p>
@@ -1428,7 +1428,7 @@
           <w:sz w:val="21"/>
           <w:szCs w:val="21"/>
         </w:rPr>
-        <w:t xml:space="preserve">Sie sprechen direkt mit dem Entwickler. Entscheidungen fallen schnell, Änderungen lassen sich leicht besprechen.</w:t>
+        <w:t xml:space="preserve">Bedarf, Zahlungsbereitschaft und Supportkosten werden vor dem Ausbau geprüft.</w:t>
       </w:r>
     </w:p>
     <w:p>
@@ -1446,7 +1446,7 @@
           <w:sz w:val="26"/>
           <w:szCs w:val="26"/>
         </w:rPr>
-        <w:t xml:space="preserve">Durch echte Produkte belegt</w:t>
+        <w:t xml:space="preserve">Klares Eigentum</w:t>
       </w:r>
     </w:p>
     <w:p>
@@ -1464,7 +1464,7 @@
           <w:sz w:val="21"/>
           <w:szCs w:val="21"/>
         </w:rPr>
-        <w:t xml:space="preserve">Rieltix, Mapest und Forma sind live — Sie sehen die Qualität vor dem Start.</w:t>
+        <w:t xml:space="preserve">Rechte an Code, Daten und Produkt werden vor Entwicklungsstart festgelegt.</w:t>
       </w:r>
     </w:p>
     <w:p>
@@ -1482,7 +1482,7 @@
           <w:sz w:val="26"/>
           <w:szCs w:val="26"/>
         </w:rPr>
-        <w:t xml:space="preserve">Angemessenes Budget</w:t>
+        <w:t xml:space="preserve">Definiertes Abo</w:t>
       </w:r>
     </w:p>
     <w:p>
@@ -1500,7 +1500,7 @@
           <w:sz w:val="21"/>
           <w:szCs w:val="21"/>
         </w:rPr>
-        <w:t xml:space="preserve">Nur benötigte Funktionen, ohne den Aufwand einer großen Agentur. Als Projekt oder monatlich.</w:t>
+        <w:t xml:space="preserve">Leistungsumfang und Preis werden direkt am gemeinsamen Produkt festgemacht.</w:t>
       </w:r>
     </w:p>
     <w:p>
@@ -1518,7 +1518,7 @@
           <w:sz w:val="26"/>
           <w:szCs w:val="26"/>
         </w:rPr>
-        <w:t xml:space="preserve">Schrittweise Umsetzung</w:t>
+        <w:t xml:space="preserve">Gemeinsame Roadmap</w:t>
       </w:r>
     </w:p>
     <w:p>
@@ -1536,7 +1536,7 @@
           <w:sz w:val="21"/>
           <w:szCs w:val="21"/>
         </w:rPr>
-        <w:t xml:space="preserve">Beginnen Sie mit einem wichtigen Prozess, sehen Sie das Ergebnis und erweitern Sie anschließend.</w:t>
+        <w:t xml:space="preserve">Gemeinsame Funktionen entwickeln sich für alle; individuelle Bedürfnisse bleiben Erweiterungen.</w:t>
       </w:r>
     </w:p>
     <w:p>
@@ -1554,7 +1554,7 @@
           <w:sz w:val="26"/>
           <w:szCs w:val="26"/>
         </w:rPr>
-        <w:t xml:space="preserve">Support &amp; Weiterentwicklung</w:t>
+        <w:t xml:space="preserve">Kontinuierliche Entwicklung</w:t>
       </w:r>
     </w:p>
     <w:p>
@@ -1572,7 +1572,7 @@
           <w:sz w:val="21"/>
           <w:szCs w:val="21"/>
         </w:rPr>
-        <w:t xml:space="preserve">Nach dem Start betreuen und verbessern wir das Produkt zu vereinbarten Bedingungen.</w:t>
+        <w:t xml:space="preserve">Kundenfeedback wird strukturiert in die Produktentwicklung eingebunden.</w:t>
       </w:r>
     </w:p>
     <w:p>
@@ -1615,7 +1615,7 @@
           <w:sz w:val="17"/>
           <w:szCs w:val="17"/>
         </w:rPr>
-        <w:t xml:space="preserve">FORMEN DER ZUSAMMENARBEIT</w:t>
+        <w:t xml:space="preserve">ZWEI STARTWEGE</w:t>
       </w:r>
     </w:p>
     <w:p>
@@ -1651,7 +1651,7 @@
           <w:sz w:val="21"/>
           <w:szCs w:val="21"/>
         </w:rPr>
-        <w:t xml:space="preserve">Eine Lösung von Grund auf für Ihre spezifische Aufgabe.</w:t>
+        <w:t xml:space="preserve">Eine definierte Lösung für Ihren eigenen Betrieb.</w:t>
       </w:r>
     </w:p>
     <w:p>
@@ -1669,7 +1669,7 @@
           <w:sz w:val="21"/>
           <w:szCs w:val="21"/>
         </w:rPr>
-        <w:t xml:space="preserve">Monatliches Abo</w:t>
+        <w:t xml:space="preserve">Produktpartnerschaft</w:t>
       </w:r>
     </w:p>
     <w:p>
@@ -1687,7 +1687,7 @@
           <w:sz w:val="21"/>
           <w:szCs w:val="21"/>
         </w:rPr>
-        <w:t xml:space="preserve">Ausgewählte Leistungen und Produkte sind im Monatsplan verfügbar.</w:t>
+        <w:t xml:space="preserve">Beginnen Sie mit einem gemeinsamen Problem und prüfen Sie ein wiederverwendbares Produkt.</w:t>
       </w:r>
     </w:p>
     <w:p>
@@ -1907,7 +1907,7 @@
           <w:sz w:val="23"/>
           <w:szCs w:val="23"/>
         </w:rPr>
-        <w:t xml:space="preserve">Sie haben eine Idee oder ein Geschäftsproblem, das automatisiert werden soll?</w:t>
+        <w:t xml:space="preserve">Sie haben ein Geschäftsproblem, das auch andere Unternehmen haben könnten?</w:t>
       </w:r>
     </w:p>
     <w:p>
@@ -1925,7 +1925,7 @@
           <w:sz w:val="23"/>
           <w:szCs w:val="23"/>
         </w:rPr>
-        <w:t xml:space="preserve">Sprechen wir über die Lösung.</w:t>
+        <w:t xml:space="preserve">Prüfen wir, ob daraus ein Produkt entstehen sollte.</w:t>
       </w:r>
     </w:p>
     <w:p>
@@ -1943,7 +1943,7 @@
           <w:sz w:val="21"/>
           <w:szCs w:val="21"/>
         </w:rPr>
-        <w:t xml:space="preserve">Schreiben Sie uns — wir antworten und finden einen passenden Termin für ein Beratungsgespräch.</w:t>
+        <w:t xml:space="preserve">Beschreiben Sie den Prozess, wer betroffen ist und was das gewünschte Ergebnis ist.</w:t>
       </w:r>
     </w:p>
     <w:p>

</xml_diff>

<commit_message>
Replace Mapest card with fully loaded screenshot
</commit_message>
<xml_diff>
--- a/site/Company_Profile_DE.docx
+++ b/site/Company_Profile_DE.docx
@@ -468,7 +468,7 @@
       <w:pPr>
         <w:spacing w:after="100"/>
       </w:pPr>
-      <w:hyperlink w:history="1" r:id="rIdfe0jyven0trqvdixti7pb">
+      <w:hyperlink w:history="1" r:id="rIdumwgyospidmplriq4dmya">
         <w:r>
           <w:rPr>
             <w:rFonts w:ascii="Aptos" w:cs="Aptos" w:eastAsia="Aptos" w:hAnsi="Aptos"/>
@@ -602,7 +602,7 @@
       <w:pPr>
         <w:spacing w:after="100"/>
       </w:pPr>
-      <w:hyperlink w:history="1" r:id="rIdsplmimaunh2gufsmvektc">
+      <w:hyperlink w:history="1" r:id="rIdmc0wenkzomlrxhp5tlw7h">
         <w:r>
           <w:rPr>
             <w:rFonts w:ascii="Aptos" w:cs="Aptos" w:eastAsia="Aptos" w:hAnsi="Aptos"/>
@@ -736,7 +736,7 @@
       <w:pPr>
         <w:spacing w:after="100"/>
       </w:pPr>
-      <w:hyperlink w:history="1" r:id="rIdmvyohkfn9dbe9cpe4dqxo">
+      <w:hyperlink w:history="1" r:id="rIdpez2uevpv6cm_d8paq_vm">
         <w:r>
           <w:rPr>
             <w:rFonts w:ascii="Aptos" w:cs="Aptos" w:eastAsia="Aptos" w:hAnsi="Aptos"/>

</xml_diff>

<commit_message>
Install XCOMBINE brand assets and define delivery workflow
</commit_message>
<xml_diff>
--- a/site/Company_Profile_DE.docx
+++ b/site/Company_Profile_DE.docx
@@ -468,7 +468,7 @@
       <w:pPr>
         <w:spacing w:after="100"/>
       </w:pPr>
-      <w:hyperlink w:history="1" r:id="rIdumwgyospidmplriq4dmya">
+      <w:hyperlink w:history="1" r:id="rIdewddnczcitp_dlkgpti_5">
         <w:r>
           <w:rPr>
             <w:rFonts w:ascii="Aptos" w:cs="Aptos" w:eastAsia="Aptos" w:hAnsi="Aptos"/>
@@ -602,7 +602,7 @@
       <w:pPr>
         <w:spacing w:after="100"/>
       </w:pPr>
-      <w:hyperlink w:history="1" r:id="rIdmc0wenkzomlrxhp5tlw7h">
+      <w:hyperlink w:history="1" r:id="rIdtgn7zerambgji5cteatdm">
         <w:r>
           <w:rPr>
             <w:rFonts w:ascii="Aptos" w:cs="Aptos" w:eastAsia="Aptos" w:hAnsi="Aptos"/>
@@ -736,7 +736,7 @@
       <w:pPr>
         <w:spacing w:after="100"/>
       </w:pPr>
-      <w:hyperlink w:history="1" r:id="rIdpez2uevpv6cm_d8paq_vm">
+      <w:hyperlink w:history="1" r:id="rId0wx__kmgb5lddcdfit8ts">
         <w:r>
           <w:rPr>
             <w:rFonts w:ascii="Aptos" w:cs="Aptos" w:eastAsia="Aptos" w:hAnsi="Aptos"/>

</xml_diff>

<commit_message>
Polish multilingual layout and export controls
</commit_message>
<xml_diff>
--- a/site/Company_Profile_DE.docx
+++ b/site/Company_Profile_DE.docx
@@ -468,7 +468,7 @@
       <w:pPr>
         <w:spacing w:after="100"/>
       </w:pPr>
-      <w:hyperlink w:history="1" r:id="rIdewddnczcitp_dlkgpti_5">
+      <w:hyperlink w:history="1" r:id="rIdhjyautadgzuuaprrxfv-i">
         <w:r>
           <w:rPr>
             <w:rFonts w:ascii="Aptos" w:cs="Aptos" w:eastAsia="Aptos" w:hAnsi="Aptos"/>
@@ -602,7 +602,7 @@
       <w:pPr>
         <w:spacing w:after="100"/>
       </w:pPr>
-      <w:hyperlink w:history="1" r:id="rIdtgn7zerambgji5cteatdm">
+      <w:hyperlink w:history="1" r:id="rIdt_wsuxnjr38j8vfhqolvk">
         <w:r>
           <w:rPr>
             <w:rFonts w:ascii="Aptos" w:cs="Aptos" w:eastAsia="Aptos" w:hAnsi="Aptos"/>
@@ -736,7 +736,7 @@
       <w:pPr>
         <w:spacing w:after="100"/>
       </w:pPr>
-      <w:hyperlink w:history="1" r:id="rId0wx__kmgb5lddcdfit8ts">
+      <w:hyperlink w:history="1" r:id="rIdhfxacpbqzrbua_faqk7ur">
         <w:r>
           <w:rPr>
             <w:rFonts w:ascii="Aptos" w:cs="Aptos" w:eastAsia="Aptos" w:hAnsi="Aptos"/>

</xml_diff>

<commit_message>
Improve public exports and mobile layout
</commit_message>
<xml_diff>
--- a/site/Company_Profile_DE.docx
+++ b/site/Company_Profile_DE.docx
@@ -468,7 +468,7 @@
       <w:pPr>
         <w:spacing w:after="100"/>
       </w:pPr>
-      <w:hyperlink w:history="1" r:id="rIdhjyautadgzuuaprrxfv-i">
+      <w:hyperlink w:history="1" r:id="rIdaezxcfskdd8omb45kzuxk">
         <w:r>
           <w:rPr>
             <w:rFonts w:ascii="Aptos" w:cs="Aptos" w:eastAsia="Aptos" w:hAnsi="Aptos"/>
@@ -602,7 +602,7 @@
       <w:pPr>
         <w:spacing w:after="100"/>
       </w:pPr>
-      <w:hyperlink w:history="1" r:id="rIdt_wsuxnjr38j8vfhqolvk">
+      <w:hyperlink w:history="1" r:id="rIdyk1egv-4-m0ybslrubwbb">
         <w:r>
           <w:rPr>
             <w:rFonts w:ascii="Aptos" w:cs="Aptos" w:eastAsia="Aptos" w:hAnsi="Aptos"/>
@@ -736,7 +736,7 @@
       <w:pPr>
         <w:spacing w:after="100"/>
       </w:pPr>
-      <w:hyperlink w:history="1" r:id="rIdhfxacpbqzrbua_faqk7ur">
+      <w:hyperlink w:history="1" r:id="rId01sqvcexeceyfl0yldytk">
         <w:r>
           <w:rPr>
             <w:rFonts w:ascii="Aptos" w:cs="Aptos" w:eastAsia="Aptos" w:hAnsi="Aptos"/>

</xml_diff>

<commit_message>
Add AI crawler discovery files
</commit_message>
<xml_diff>
--- a/site/Company_Profile_DE.docx
+++ b/site/Company_Profile_DE.docx
@@ -468,7 +468,7 @@
       <w:pPr>
         <w:spacing w:after="100"/>
       </w:pPr>
-      <w:hyperlink w:history="1" r:id="rIdaezxcfskdd8omb45kzuxk">
+      <w:hyperlink w:history="1" r:id="rIdssvnw6etru_y-eu43gdpy">
         <w:r>
           <w:rPr>
             <w:rFonts w:ascii="Aptos" w:cs="Aptos" w:eastAsia="Aptos" w:hAnsi="Aptos"/>
@@ -602,7 +602,7 @@
       <w:pPr>
         <w:spacing w:after="100"/>
       </w:pPr>
-      <w:hyperlink w:history="1" r:id="rIdyk1egv-4-m0ybslrubwbb">
+      <w:hyperlink w:history="1" r:id="rIdli1jvkm4iywgyfukgtvgk">
         <w:r>
           <w:rPr>
             <w:rFonts w:ascii="Aptos" w:cs="Aptos" w:eastAsia="Aptos" w:hAnsi="Aptos"/>
@@ -736,7 +736,7 @@
       <w:pPr>
         <w:spacing w:after="100"/>
       </w:pPr>
-      <w:hyperlink w:history="1" r:id="rId01sqvcexeceyfl0yldytk">
+      <w:hyperlink w:history="1" r:id="rIdul8st4ixqnxhtfizqi_3w">
         <w:r>
           <w:rPr>
             <w:rFonts w:ascii="Aptos" w:cs="Aptos" w:eastAsia="Aptos" w:hAnsi="Aptos"/>
@@ -1961,6 +1961,31 @@
           <w:szCs w:val="17"/>
         </w:rPr>
         <w:t xml:space="preserve">KONTAKT</w:t>
+      </w:r>
+    </w:p>
+    <w:p>
+      <w:pPr>
+        <w:spacing w:after="90" w:line="270"/>
+      </w:pPr>
+      <w:r>
+        <w:rPr>
+          <w:rFonts w:ascii="Aptos" w:cs="Aptos" w:eastAsia="Aptos" w:hAnsi="Aptos"/>
+          <w:b/>
+          <w:bCs/>
+          <w:color w:val="17324D"/>
+          <w:sz w:val="20"/>
+          <w:szCs w:val="20"/>
+        </w:rPr>
+        <w:t xml:space="preserve">Email: </w:t>
+      </w:r>
+      <w:r>
+        <w:rPr>
+          <w:rFonts w:ascii="Aptos" w:cs="Aptos" w:eastAsia="Aptos" w:hAnsi="Aptos"/>
+          <w:color w:val="425466"/>
+          <w:sz w:val="20"/>
+          <w:szCs w:val="20"/>
+        </w:rPr>
+        <w:t xml:space="preserve">help@xcombine.xyz</w:t>
       </w:r>
     </w:p>
     <w:p>

</xml_diff>